<commit_message>
Implement synthetic Setting IV simulations
</commit_message>
<xml_diff>
--- a/Simulation_random_walk/Writing/generated_tables/completed_main_tables.docx
+++ b/Simulation_random_walk/Writing/generated_tables/completed_main_tables.docx
@@ -5589,6 +5589,1273 @@
         </w:tc>
       </w:tr>
     </w:tbl>
+    <w:p>
+      <w:r>
+        <w:rPr>
+          <w:b/>
+        </w:rPr>
+        <w:t>Table 3: Simulation Results for Setting IV. For each setting, we run 200 replicates.</w:t>
+      </w:r>
+    </w:p>
+    <w:tbl>
+      <w:tblPr>
+        <w:tblStyle w:val="TableGrid"/>
+        <w:tblW w:w="0" w:type="auto"/>
+        <w:tblBorders>
+          <w:top w:val="single" w:sz="4" w:space="0" w:color="auto"/>
+          <w:left w:val="single" w:sz="4" w:space="0" w:color="auto"/>
+          <w:bottom w:val="single" w:sz="4" w:space="0" w:color="auto"/>
+          <w:right w:val="single" w:sz="4" w:space="0" w:color="auto"/>
+          <w:insideH w:val="single" w:sz="4" w:space="0" w:color="auto"/>
+          <w:insideV w:val="single" w:sz="4" w:space="0" w:color="auto"/>
+        </w:tblBorders>
+      </w:tblPr>
+      <w:tr>
+        <w:tc>
+          <w:tcPr>
+            <w:tcW w:w="1800" w:type="dxa"/>
+          </w:tcPr>
+          <w:p>
+            <w:r>
+              <w:rPr>
+                <w:b/>
+              </w:rPr>
+              <w:t>setting</w:t>
+            </w:r>
+          </w:p>
+        </w:tc>
+        <w:tc>
+          <w:tcPr>
+            <w:tcW w:w="1800" w:type="dxa"/>
+          </w:tcPr>
+          <w:p>
+            <w:r>
+              <w:rPr>
+                <w:b/>
+              </w:rPr>
+              <w:t>n</w:t>
+            </w:r>
+          </w:p>
+        </w:tc>
+        <w:tc>
+          <w:tcPr>
+            <w:tcW w:w="1800" w:type="dxa"/>
+          </w:tcPr>
+          <w:p>
+            <w:r>
+              <w:rPr>
+                <w:b/>
+              </w:rPr>
+              <w:t>method</w:t>
+            </w:r>
+          </w:p>
+        </w:tc>
+        <w:tc>
+          <w:tcPr>
+            <w:tcW w:w="1800" w:type="dxa"/>
+          </w:tcPr>
+          <w:p>
+            <w:r>
+              <w:rPr>
+                <w:b/>
+              </w:rPr>
+              <w:t>allocation_matching</w:t>
+            </w:r>
+          </w:p>
+        </w:tc>
+        <w:tc>
+          <w:tcPr>
+            <w:tcW w:w="1800" w:type="dxa"/>
+          </w:tcPr>
+          <w:p>
+            <w:r>
+              <w:rPr>
+                <w:b/>
+              </w:rPr>
+              <w:t>weighted_allocation_matching</w:t>
+            </w:r>
+          </w:p>
+        </w:tc>
+        <w:tc>
+          <w:tcPr>
+            <w:tcW w:w="1800" w:type="dxa"/>
+          </w:tcPr>
+          <w:p>
+            <w:r>
+              <w:rPr>
+                <w:b/>
+              </w:rPr>
+              <w:t>a_ff_match</w:t>
+            </w:r>
+          </w:p>
+        </w:tc>
+        <w:tc>
+          <w:tcPr>
+            <w:tcW w:w="1800" w:type="dxa"/>
+          </w:tcPr>
+          <w:p>
+            <w:r>
+              <w:rPr>
+                <w:b/>
+              </w:rPr>
+              <w:t>mean_abs_bias</w:t>
+            </w:r>
+          </w:p>
+        </w:tc>
+      </w:tr>
+      <w:tr>
+        <w:tc>
+          <w:tcPr>
+            <w:tcW w:w="1800" w:type="dxa"/>
+          </w:tcPr>
+          <w:p>
+            <w:r>
+              <w:t>IV</w:t>
+            </w:r>
+          </w:p>
+        </w:tc>
+        <w:tc>
+          <w:tcPr>
+            <w:tcW w:w="1800" w:type="dxa"/>
+          </w:tcPr>
+          <w:p>
+            <w:r>
+              <w:t>100</w:t>
+            </w:r>
+          </w:p>
+        </w:tc>
+        <w:tc>
+          <w:tcPr>
+            <w:tcW w:w="1800" w:type="dxa"/>
+          </w:tcPr>
+          <w:p>
+            <w:r>
+              <w:t>Q learning</w:t>
+            </w:r>
+          </w:p>
+        </w:tc>
+        <w:tc>
+          <w:tcPr>
+            <w:tcW w:w="1800" w:type="dxa"/>
+          </w:tcPr>
+          <w:p>
+            <w:r>
+              <w:t>0.547 (0.335)</w:t>
+            </w:r>
+          </w:p>
+        </w:tc>
+        <w:tc>
+          <w:tcPr>
+            <w:tcW w:w="1800" w:type="dxa"/>
+          </w:tcPr>
+          <w:p>
+            <w:r>
+              <w:t>0.850 (0.126)</w:t>
+            </w:r>
+          </w:p>
+        </w:tc>
+        <w:tc>
+          <w:tcPr>
+            <w:tcW w:w="1800" w:type="dxa"/>
+          </w:tcPr>
+          <w:p>
+            <w:r>
+              <w:t>0.904 (0.101)</w:t>
+            </w:r>
+          </w:p>
+        </w:tc>
+        <w:tc>
+          <w:tcPr>
+            <w:tcW w:w="1800" w:type="dxa"/>
+          </w:tcPr>
+          <w:p>
+            <w:r>
+              <w:t>0.144656567578215</w:t>
+            </w:r>
+          </w:p>
+        </w:tc>
+      </w:tr>
+      <w:tr>
+        <w:tc>
+          <w:tcPr>
+            <w:tcW w:w="1800" w:type="dxa"/>
+          </w:tcPr>
+          <w:p>
+            <w:r>
+              <w:t>IV</w:t>
+            </w:r>
+          </w:p>
+        </w:tc>
+        <w:tc>
+          <w:tcPr>
+            <w:tcW w:w="1800" w:type="dxa"/>
+          </w:tcPr>
+          <w:p>
+            <w:r>
+              <w:t>100</w:t>
+            </w:r>
+          </w:p>
+        </w:tc>
+        <w:tc>
+          <w:tcPr>
+            <w:tcW w:w="1800" w:type="dxa"/>
+          </w:tcPr>
+          <w:p>
+            <w:r>
+              <w:t>Q shared</w:t>
+            </w:r>
+          </w:p>
+        </w:tc>
+        <w:tc>
+          <w:tcPr>
+            <w:tcW w:w="1800" w:type="dxa"/>
+          </w:tcPr>
+          <w:p>
+            <w:r>
+              <w:t>0.538 (0.358)</w:t>
+            </w:r>
+          </w:p>
+        </w:tc>
+        <w:tc>
+          <w:tcPr>
+            <w:tcW w:w="1800" w:type="dxa"/>
+          </w:tcPr>
+          <w:p>
+            <w:r>
+              <w:t>0.849 (0.134)</w:t>
+            </w:r>
+          </w:p>
+        </w:tc>
+        <w:tc>
+          <w:tcPr>
+            <w:tcW w:w="1800" w:type="dxa"/>
+          </w:tcPr>
+          <w:p>
+            <w:r>
+              <w:t>0.887 (0.147)</w:t>
+            </w:r>
+          </w:p>
+        </w:tc>
+        <w:tc>
+          <w:tcPr>
+            <w:tcW w:w="1800" w:type="dxa"/>
+          </w:tcPr>
+          <w:p>
+            <w:r>
+              <w:t>0.120933504946472</w:t>
+            </w:r>
+          </w:p>
+        </w:tc>
+      </w:tr>
+      <w:tr>
+        <w:tc>
+          <w:tcPr>
+            <w:tcW w:w="1800" w:type="dxa"/>
+          </w:tcPr>
+          <w:p>
+            <w:r>
+              <w:t>IV</w:t>
+            </w:r>
+          </w:p>
+        </w:tc>
+        <w:tc>
+          <w:tcPr>
+            <w:tcW w:w="1800" w:type="dxa"/>
+          </w:tcPr>
+          <w:p>
+            <w:r>
+              <w:t>100</w:t>
+            </w:r>
+          </w:p>
+        </w:tc>
+        <w:tc>
+          <w:tcPr>
+            <w:tcW w:w="1800" w:type="dxa"/>
+          </w:tcPr>
+          <w:p>
+            <w:r>
+              <w:t>SQ learning (L1 penalty)</w:t>
+            </w:r>
+          </w:p>
+        </w:tc>
+        <w:tc>
+          <w:tcPr>
+            <w:tcW w:w="1800" w:type="dxa"/>
+          </w:tcPr>
+          <w:p>
+            <w:r>
+              <w:t>0.567 (0.342)</w:t>
+            </w:r>
+          </w:p>
+        </w:tc>
+        <w:tc>
+          <w:tcPr>
+            <w:tcW w:w="1800" w:type="dxa"/>
+          </w:tcPr>
+          <w:p>
+            <w:r>
+              <w:t>0.857 (0.128)</w:t>
+            </w:r>
+          </w:p>
+        </w:tc>
+        <w:tc>
+          <w:tcPr>
+            <w:tcW w:w="1800" w:type="dxa"/>
+          </w:tcPr>
+          <w:p>
+            <w:r>
+              <w:t>0.908 (0.115)</w:t>
+            </w:r>
+          </w:p>
+        </w:tc>
+        <w:tc>
+          <w:tcPr>
+            <w:tcW w:w="1800" w:type="dxa"/>
+          </w:tcPr>
+          <w:p>
+            <w:r>
+              <w:t>0.129345425037126</w:t>
+            </w:r>
+          </w:p>
+        </w:tc>
+      </w:tr>
+      <w:tr>
+        <w:tc>
+          <w:tcPr>
+            <w:tcW w:w="1800" w:type="dxa"/>
+          </w:tcPr>
+          <w:p>
+            <w:r>
+              <w:t>IV</w:t>
+            </w:r>
+          </w:p>
+        </w:tc>
+        <w:tc>
+          <w:tcPr>
+            <w:tcW w:w="1800" w:type="dxa"/>
+          </w:tcPr>
+          <w:p>
+            <w:r>
+              <w:t>100</w:t>
+            </w:r>
+          </w:p>
+        </w:tc>
+        <w:tc>
+          <w:tcPr>
+            <w:tcW w:w="1800" w:type="dxa"/>
+          </w:tcPr>
+          <w:p>
+            <w:r>
+              <w:t>SQ learning (L2 penalty)</w:t>
+            </w:r>
+          </w:p>
+        </w:tc>
+        <w:tc>
+          <w:tcPr>
+            <w:tcW w:w="1800" w:type="dxa"/>
+          </w:tcPr>
+          <w:p>
+            <w:r>
+              <w:t>0.571 (0.339)</w:t>
+            </w:r>
+          </w:p>
+        </w:tc>
+        <w:tc>
+          <w:tcPr>
+            <w:tcW w:w="1800" w:type="dxa"/>
+          </w:tcPr>
+          <w:p>
+            <w:r>
+              <w:t>0.859 (0.126)</w:t>
+            </w:r>
+          </w:p>
+        </w:tc>
+        <w:tc>
+          <w:tcPr>
+            <w:tcW w:w="1800" w:type="dxa"/>
+          </w:tcPr>
+          <w:p>
+            <w:r>
+              <w:t>0.913 (0.105)</w:t>
+            </w:r>
+          </w:p>
+        </w:tc>
+        <w:tc>
+          <w:tcPr>
+            <w:tcW w:w="1800" w:type="dxa"/>
+          </w:tcPr>
+          <w:p>
+            <w:r>
+              <w:t>0.133718076399733</w:t>
+            </w:r>
+          </w:p>
+        </w:tc>
+      </w:tr>
+      <w:tr>
+        <w:tc>
+          <w:tcPr>
+            <w:tcW w:w="1800" w:type="dxa"/>
+          </w:tcPr>
+          <w:p>
+            <w:r>
+              <w:t>IV</w:t>
+            </w:r>
+          </w:p>
+        </w:tc>
+        <w:tc>
+          <w:tcPr>
+            <w:tcW w:w="1800" w:type="dxa"/>
+          </w:tcPr>
+          <w:p>
+            <w:r>
+              <w:t>300</w:t>
+            </w:r>
+          </w:p>
+        </w:tc>
+        <w:tc>
+          <w:tcPr>
+            <w:tcW w:w="1800" w:type="dxa"/>
+          </w:tcPr>
+          <w:p>
+            <w:r>
+              <w:t>Q learning</w:t>
+            </w:r>
+          </w:p>
+        </w:tc>
+        <w:tc>
+          <w:tcPr>
+            <w:tcW w:w="1800" w:type="dxa"/>
+          </w:tcPr>
+          <w:p>
+            <w:r>
+              <w:t>0.793 (0.277)</w:t>
+            </w:r>
+          </w:p>
+        </w:tc>
+        <w:tc>
+          <w:tcPr>
+            <w:tcW w:w="1800" w:type="dxa"/>
+          </w:tcPr>
+          <w:p>
+            <w:r>
+              <w:t>0.935 (0.095)</w:t>
+            </w:r>
+          </w:p>
+        </w:tc>
+        <w:tc>
+          <w:tcPr>
+            <w:tcW w:w="1800" w:type="dxa"/>
+          </w:tcPr>
+          <w:p>
+            <w:r>
+              <w:t>0.966 (0.053)</w:t>
+            </w:r>
+          </w:p>
+        </w:tc>
+        <w:tc>
+          <w:tcPr>
+            <w:tcW w:w="1800" w:type="dxa"/>
+          </w:tcPr>
+          <w:p>
+            <w:r>
+              <w:t>0.0801387577554621</w:t>
+            </w:r>
+          </w:p>
+        </w:tc>
+      </w:tr>
+      <w:tr>
+        <w:tc>
+          <w:tcPr>
+            <w:tcW w:w="1800" w:type="dxa"/>
+          </w:tcPr>
+          <w:p>
+            <w:r>
+              <w:t>IV</w:t>
+            </w:r>
+          </w:p>
+        </w:tc>
+        <w:tc>
+          <w:tcPr>
+            <w:tcW w:w="1800" w:type="dxa"/>
+          </w:tcPr>
+          <w:p>
+            <w:r>
+              <w:t>300</w:t>
+            </w:r>
+          </w:p>
+        </w:tc>
+        <w:tc>
+          <w:tcPr>
+            <w:tcW w:w="1800" w:type="dxa"/>
+          </w:tcPr>
+          <w:p>
+            <w:r>
+              <w:t>Q shared</w:t>
+            </w:r>
+          </w:p>
+        </w:tc>
+        <w:tc>
+          <w:tcPr>
+            <w:tcW w:w="1800" w:type="dxa"/>
+          </w:tcPr>
+          <w:p>
+            <w:r>
+              <w:t>0.803 (0.275)</w:t>
+            </w:r>
+          </w:p>
+        </w:tc>
+        <w:tc>
+          <w:tcPr>
+            <w:tcW w:w="1800" w:type="dxa"/>
+          </w:tcPr>
+          <w:p>
+            <w:r>
+              <w:t>0.939 (0.094)</w:t>
+            </w:r>
+          </w:p>
+        </w:tc>
+        <w:tc>
+          <w:tcPr>
+            <w:tcW w:w="1800" w:type="dxa"/>
+          </w:tcPr>
+          <w:p>
+            <w:r>
+              <w:t>0.964 (0.059)</w:t>
+            </w:r>
+          </w:p>
+        </w:tc>
+        <w:tc>
+          <w:tcPr>
+            <w:tcW w:w="1800" w:type="dxa"/>
+          </w:tcPr>
+          <w:p>
+            <w:r>
+              <w:t>0.0691039042967986</w:t>
+            </w:r>
+          </w:p>
+        </w:tc>
+      </w:tr>
+      <w:tr>
+        <w:tc>
+          <w:tcPr>
+            <w:tcW w:w="1800" w:type="dxa"/>
+          </w:tcPr>
+          <w:p>
+            <w:r>
+              <w:t>IV</w:t>
+            </w:r>
+          </w:p>
+        </w:tc>
+        <w:tc>
+          <w:tcPr>
+            <w:tcW w:w="1800" w:type="dxa"/>
+          </w:tcPr>
+          <w:p>
+            <w:r>
+              <w:t>300</w:t>
+            </w:r>
+          </w:p>
+        </w:tc>
+        <w:tc>
+          <w:tcPr>
+            <w:tcW w:w="1800" w:type="dxa"/>
+          </w:tcPr>
+          <w:p>
+            <w:r>
+              <w:t>SQ learning (L1 penalty)</w:t>
+            </w:r>
+          </w:p>
+        </w:tc>
+        <w:tc>
+          <w:tcPr>
+            <w:tcW w:w="1800" w:type="dxa"/>
+          </w:tcPr>
+          <w:p>
+            <w:r>
+              <w:t>0.809 (0.267)</w:t>
+            </w:r>
+          </w:p>
+        </w:tc>
+        <w:tc>
+          <w:tcPr>
+            <w:tcW w:w="1800" w:type="dxa"/>
+          </w:tcPr>
+          <w:p>
+            <w:r>
+              <w:t>0.940 (0.091)</w:t>
+            </w:r>
+          </w:p>
+        </w:tc>
+        <w:tc>
+          <w:tcPr>
+            <w:tcW w:w="1800" w:type="dxa"/>
+          </w:tcPr>
+          <w:p>
+            <w:r>
+              <w:t>0.966 (0.055)</w:t>
+            </w:r>
+          </w:p>
+        </w:tc>
+        <w:tc>
+          <w:tcPr>
+            <w:tcW w:w="1800" w:type="dxa"/>
+          </w:tcPr>
+          <w:p>
+            <w:r>
+              <w:t>0.0700074401145421</w:t>
+            </w:r>
+          </w:p>
+        </w:tc>
+      </w:tr>
+      <w:tr>
+        <w:tc>
+          <w:tcPr>
+            <w:tcW w:w="1800" w:type="dxa"/>
+          </w:tcPr>
+          <w:p>
+            <w:r>
+              <w:t>IV</w:t>
+            </w:r>
+          </w:p>
+        </w:tc>
+        <w:tc>
+          <w:tcPr>
+            <w:tcW w:w="1800" w:type="dxa"/>
+          </w:tcPr>
+          <w:p>
+            <w:r>
+              <w:t>300</w:t>
+            </w:r>
+          </w:p>
+        </w:tc>
+        <w:tc>
+          <w:tcPr>
+            <w:tcW w:w="1800" w:type="dxa"/>
+          </w:tcPr>
+          <w:p>
+            <w:r>
+              <w:t>SQ learning (L2 penalty)</w:t>
+            </w:r>
+          </w:p>
+        </w:tc>
+        <w:tc>
+          <w:tcPr>
+            <w:tcW w:w="1800" w:type="dxa"/>
+          </w:tcPr>
+          <w:p>
+            <w:r>
+              <w:t>0.802 (0.275)</w:t>
+            </w:r>
+          </w:p>
+        </w:tc>
+        <w:tc>
+          <w:tcPr>
+            <w:tcW w:w="1800" w:type="dxa"/>
+          </w:tcPr>
+          <w:p>
+            <w:r>
+              <w:t>0.938 (0.094)</w:t>
+            </w:r>
+          </w:p>
+        </w:tc>
+        <w:tc>
+          <w:tcPr>
+            <w:tcW w:w="1800" w:type="dxa"/>
+          </w:tcPr>
+          <w:p>
+            <w:r>
+              <w:t>0.967 (0.052)</w:t>
+            </w:r>
+          </w:p>
+        </w:tc>
+        <w:tc>
+          <w:tcPr>
+            <w:tcW w:w="1800" w:type="dxa"/>
+          </w:tcPr>
+          <w:p>
+            <w:r>
+              <w:t>0.074558735785123</w:t>
+            </w:r>
+          </w:p>
+        </w:tc>
+      </w:tr>
+      <w:tr>
+        <w:tc>
+          <w:tcPr>
+            <w:tcW w:w="1800" w:type="dxa"/>
+          </w:tcPr>
+          <w:p>
+            <w:r>
+              <w:t>IV</w:t>
+            </w:r>
+          </w:p>
+        </w:tc>
+        <w:tc>
+          <w:tcPr>
+            <w:tcW w:w="1800" w:type="dxa"/>
+          </w:tcPr>
+          <w:p>
+            <w:r>
+              <w:t>500</w:t>
+            </w:r>
+          </w:p>
+        </w:tc>
+        <w:tc>
+          <w:tcPr>
+            <w:tcW w:w="1800" w:type="dxa"/>
+          </w:tcPr>
+          <w:p>
+            <w:r>
+              <w:t>Q learning</w:t>
+            </w:r>
+          </w:p>
+        </w:tc>
+        <w:tc>
+          <w:tcPr>
+            <w:tcW w:w="1800" w:type="dxa"/>
+          </w:tcPr>
+          <w:p>
+            <w:r>
+              <w:t>0.865 (0.218)</w:t>
+            </w:r>
+          </w:p>
+        </w:tc>
+        <w:tc>
+          <w:tcPr>
+            <w:tcW w:w="1800" w:type="dxa"/>
+          </w:tcPr>
+          <w:p>
+            <w:r>
+              <w:t>0.958 (0.074)</w:t>
+            </w:r>
+          </w:p>
+        </w:tc>
+        <w:tc>
+          <w:tcPr>
+            <w:tcW w:w="1800" w:type="dxa"/>
+          </w:tcPr>
+          <w:p>
+            <w:r>
+              <w:t>0.981 (0.031)</w:t>
+            </w:r>
+          </w:p>
+        </w:tc>
+        <w:tc>
+          <w:tcPr>
+            <w:tcW w:w="1800" w:type="dxa"/>
+          </w:tcPr>
+          <w:p>
+            <w:r>
+              <w:t>0.0629185136431641</w:t>
+            </w:r>
+          </w:p>
+        </w:tc>
+      </w:tr>
+      <w:tr>
+        <w:tc>
+          <w:tcPr>
+            <w:tcW w:w="1800" w:type="dxa"/>
+          </w:tcPr>
+          <w:p>
+            <w:r>
+              <w:t>IV</w:t>
+            </w:r>
+          </w:p>
+        </w:tc>
+        <w:tc>
+          <w:tcPr>
+            <w:tcW w:w="1800" w:type="dxa"/>
+          </w:tcPr>
+          <w:p>
+            <w:r>
+              <w:t>500</w:t>
+            </w:r>
+          </w:p>
+        </w:tc>
+        <w:tc>
+          <w:tcPr>
+            <w:tcW w:w="1800" w:type="dxa"/>
+          </w:tcPr>
+          <w:p>
+            <w:r>
+              <w:t>Q shared</w:t>
+            </w:r>
+          </w:p>
+        </w:tc>
+        <w:tc>
+          <w:tcPr>
+            <w:tcW w:w="1800" w:type="dxa"/>
+          </w:tcPr>
+          <w:p>
+            <w:r>
+              <w:t>0.865 (0.210)</w:t>
+            </w:r>
+          </w:p>
+        </w:tc>
+        <w:tc>
+          <w:tcPr>
+            <w:tcW w:w="1800" w:type="dxa"/>
+          </w:tcPr>
+          <w:p>
+            <w:r>
+              <w:t>0.958 (0.071)</w:t>
+            </w:r>
+          </w:p>
+        </w:tc>
+        <w:tc>
+          <w:tcPr>
+            <w:tcW w:w="1800" w:type="dxa"/>
+          </w:tcPr>
+          <w:p>
+            <w:r>
+              <w:t>0.977 (0.039)</w:t>
+            </w:r>
+          </w:p>
+        </w:tc>
+        <w:tc>
+          <w:tcPr>
+            <w:tcW w:w="1800" w:type="dxa"/>
+          </w:tcPr>
+          <w:p>
+            <w:r>
+              <w:t>0.0541600431632815</w:t>
+            </w:r>
+          </w:p>
+        </w:tc>
+      </w:tr>
+      <w:tr>
+        <w:tc>
+          <w:tcPr>
+            <w:tcW w:w="1800" w:type="dxa"/>
+          </w:tcPr>
+          <w:p>
+            <w:r>
+              <w:t>IV</w:t>
+            </w:r>
+          </w:p>
+        </w:tc>
+        <w:tc>
+          <w:tcPr>
+            <w:tcW w:w="1800" w:type="dxa"/>
+          </w:tcPr>
+          <w:p>
+            <w:r>
+              <w:t>500</w:t>
+            </w:r>
+          </w:p>
+        </w:tc>
+        <w:tc>
+          <w:tcPr>
+            <w:tcW w:w="1800" w:type="dxa"/>
+          </w:tcPr>
+          <w:p>
+            <w:r>
+              <w:t>SQ learning (L1 penalty)</w:t>
+            </w:r>
+          </w:p>
+        </w:tc>
+        <w:tc>
+          <w:tcPr>
+            <w:tcW w:w="1800" w:type="dxa"/>
+          </w:tcPr>
+          <w:p>
+            <w:r>
+              <w:t>0.865 (0.210)</w:t>
+            </w:r>
+          </w:p>
+        </w:tc>
+        <w:tc>
+          <w:tcPr>
+            <w:tcW w:w="1800" w:type="dxa"/>
+          </w:tcPr>
+          <w:p>
+            <w:r>
+              <w:t>0.958 (0.071)</w:t>
+            </w:r>
+          </w:p>
+        </w:tc>
+        <w:tc>
+          <w:tcPr>
+            <w:tcW w:w="1800" w:type="dxa"/>
+          </w:tcPr>
+          <w:p>
+            <w:r>
+              <w:t>0.978 (0.037)</w:t>
+            </w:r>
+          </w:p>
+        </w:tc>
+        <w:tc>
+          <w:tcPr>
+            <w:tcW w:w="1800" w:type="dxa"/>
+          </w:tcPr>
+          <w:p>
+            <w:r>
+              <w:t>0.0545371221562564</w:t>
+            </w:r>
+          </w:p>
+        </w:tc>
+      </w:tr>
+      <w:tr>
+        <w:tc>
+          <w:tcPr>
+            <w:tcW w:w="1800" w:type="dxa"/>
+          </w:tcPr>
+          <w:p>
+            <w:r>
+              <w:t>IV</w:t>
+            </w:r>
+          </w:p>
+        </w:tc>
+        <w:tc>
+          <w:tcPr>
+            <w:tcW w:w="1800" w:type="dxa"/>
+          </w:tcPr>
+          <w:p>
+            <w:r>
+              <w:t>500</w:t>
+            </w:r>
+          </w:p>
+        </w:tc>
+        <w:tc>
+          <w:tcPr>
+            <w:tcW w:w="1800" w:type="dxa"/>
+          </w:tcPr>
+          <w:p>
+            <w:r>
+              <w:t>SQ learning (L2 penalty)</w:t>
+            </w:r>
+          </w:p>
+        </w:tc>
+        <w:tc>
+          <w:tcPr>
+            <w:tcW w:w="1800" w:type="dxa"/>
+          </w:tcPr>
+          <w:p>
+            <w:r>
+              <w:t>0.867 (0.210)</w:t>
+            </w:r>
+          </w:p>
+        </w:tc>
+        <w:tc>
+          <w:tcPr>
+            <w:tcW w:w="1800" w:type="dxa"/>
+          </w:tcPr>
+          <w:p>
+            <w:r>
+              <w:t>0.958 (0.071)</w:t>
+            </w:r>
+          </w:p>
+        </w:tc>
+        <w:tc>
+          <w:tcPr>
+            <w:tcW w:w="1800" w:type="dxa"/>
+          </w:tcPr>
+          <w:p>
+            <w:r>
+              <w:t>0.980 (0.033)</w:t>
+            </w:r>
+          </w:p>
+        </w:tc>
+        <w:tc>
+          <w:tcPr>
+            <w:tcW w:w="1800" w:type="dxa"/>
+          </w:tcPr>
+          <w:p>
+            <w:r>
+              <w:t>0.058561230416319</w:t>
+            </w:r>
+          </w:p>
+        </w:tc>
+      </w:tr>
+      <w:tr>
+        <w:tc>
+          <w:tcPr>
+            <w:tcW w:w="1800" w:type="dxa"/>
+          </w:tcPr>
+          <w:p>
+            <w:r>
+              <w:t>IV</w:t>
+            </w:r>
+          </w:p>
+        </w:tc>
+        <w:tc>
+          <w:tcPr>
+            <w:tcW w:w="1800" w:type="dxa"/>
+          </w:tcPr>
+          <w:p>
+            <w:r>
+              <w:t>1000</w:t>
+            </w:r>
+          </w:p>
+        </w:tc>
+        <w:tc>
+          <w:tcPr>
+            <w:tcW w:w="1800" w:type="dxa"/>
+          </w:tcPr>
+          <w:p>
+            <w:r>
+              <w:t>Q learning</w:t>
+            </w:r>
+          </w:p>
+        </w:tc>
+        <w:tc>
+          <w:tcPr>
+            <w:tcW w:w="1800" w:type="dxa"/>
+          </w:tcPr>
+          <w:p>
+            <w:r>
+              <w:t>0.963 (0.112)</w:t>
+            </w:r>
+          </w:p>
+        </w:tc>
+        <w:tc>
+          <w:tcPr>
+            <w:tcW w:w="1800" w:type="dxa"/>
+          </w:tcPr>
+          <w:p>
+            <w:r>
+              <w:t>0.990 (0.037)</w:t>
+            </w:r>
+          </w:p>
+        </w:tc>
+        <w:tc>
+          <w:tcPr>
+            <w:tcW w:w="1800" w:type="dxa"/>
+          </w:tcPr>
+          <w:p>
+            <w:r>
+              <w:t>0.986 (0.027)</w:t>
+            </w:r>
+          </w:p>
+        </w:tc>
+        <w:tc>
+          <w:tcPr>
+            <w:tcW w:w="1800" w:type="dxa"/>
+          </w:tcPr>
+          <w:p>
+            <w:r>
+              <w:t>0.0423314126328257</w:t>
+            </w:r>
+          </w:p>
+        </w:tc>
+      </w:tr>
+      <w:tr>
+        <w:tc>
+          <w:tcPr>
+            <w:tcW w:w="1800" w:type="dxa"/>
+          </w:tcPr>
+          <w:p>
+            <w:r>
+              <w:t>IV</w:t>
+            </w:r>
+          </w:p>
+        </w:tc>
+        <w:tc>
+          <w:tcPr>
+            <w:tcW w:w="1800" w:type="dxa"/>
+          </w:tcPr>
+          <w:p>
+            <w:r>
+              <w:t>1000</w:t>
+            </w:r>
+          </w:p>
+        </w:tc>
+        <w:tc>
+          <w:tcPr>
+            <w:tcW w:w="1800" w:type="dxa"/>
+          </w:tcPr>
+          <w:p>
+            <w:r>
+              <w:t>Q shared</w:t>
+            </w:r>
+          </w:p>
+        </w:tc>
+        <w:tc>
+          <w:tcPr>
+            <w:tcW w:w="1800" w:type="dxa"/>
+          </w:tcPr>
+          <w:p>
+            <w:r>
+              <w:t>0.963 (0.112)</w:t>
+            </w:r>
+          </w:p>
+        </w:tc>
+        <w:tc>
+          <w:tcPr>
+            <w:tcW w:w="1800" w:type="dxa"/>
+          </w:tcPr>
+          <w:p>
+            <w:r>
+              <w:t>0.990 (0.037)</w:t>
+            </w:r>
+          </w:p>
+        </w:tc>
+        <w:tc>
+          <w:tcPr>
+            <w:tcW w:w="1800" w:type="dxa"/>
+          </w:tcPr>
+          <w:p>
+            <w:r>
+              <w:t>0.986 (0.028)</w:t>
+            </w:r>
+          </w:p>
+        </w:tc>
+        <w:tc>
+          <w:tcPr>
+            <w:tcW w:w="1800" w:type="dxa"/>
+          </w:tcPr>
+          <w:p>
+            <w:r>
+              <w:t>0.0369312035471092</w:t>
+            </w:r>
+          </w:p>
+        </w:tc>
+      </w:tr>
+      <w:tr>
+        <w:tc>
+          <w:tcPr>
+            <w:tcW w:w="1800" w:type="dxa"/>
+          </w:tcPr>
+          <w:p>
+            <w:r>
+              <w:t>IV</w:t>
+            </w:r>
+          </w:p>
+        </w:tc>
+        <w:tc>
+          <w:tcPr>
+            <w:tcW w:w="1800" w:type="dxa"/>
+          </w:tcPr>
+          <w:p>
+            <w:r>
+              <w:t>1000</w:t>
+            </w:r>
+          </w:p>
+        </w:tc>
+        <w:tc>
+          <w:tcPr>
+            <w:tcW w:w="1800" w:type="dxa"/>
+          </w:tcPr>
+          <w:p>
+            <w:r>
+              <w:t>SQ learning (L1 penalty)</w:t>
+            </w:r>
+          </w:p>
+        </w:tc>
+        <w:tc>
+          <w:tcPr>
+            <w:tcW w:w="1800" w:type="dxa"/>
+          </w:tcPr>
+          <w:p>
+            <w:r>
+              <w:t>0.963 (0.112)</w:t>
+            </w:r>
+          </w:p>
+        </w:tc>
+        <w:tc>
+          <w:tcPr>
+            <w:tcW w:w="1800" w:type="dxa"/>
+          </w:tcPr>
+          <w:p>
+            <w:r>
+              <w:t>0.990 (0.037)</w:t>
+            </w:r>
+          </w:p>
+        </w:tc>
+        <w:tc>
+          <w:tcPr>
+            <w:tcW w:w="1800" w:type="dxa"/>
+          </w:tcPr>
+          <w:p>
+            <w:r>
+              <w:t>0.986 (0.028)</w:t>
+            </w:r>
+          </w:p>
+        </w:tc>
+        <w:tc>
+          <w:tcPr>
+            <w:tcW w:w="1800" w:type="dxa"/>
+          </w:tcPr>
+          <w:p>
+            <w:r>
+              <w:t>0.0368965391384083</w:t>
+            </w:r>
+          </w:p>
+        </w:tc>
+      </w:tr>
+      <w:tr>
+        <w:tc>
+          <w:tcPr>
+            <w:tcW w:w="1800" w:type="dxa"/>
+          </w:tcPr>
+          <w:p>
+            <w:r>
+              <w:t>IV</w:t>
+            </w:r>
+          </w:p>
+        </w:tc>
+        <w:tc>
+          <w:tcPr>
+            <w:tcW w:w="1800" w:type="dxa"/>
+          </w:tcPr>
+          <w:p>
+            <w:r>
+              <w:t>1000</w:t>
+            </w:r>
+          </w:p>
+        </w:tc>
+        <w:tc>
+          <w:tcPr>
+            <w:tcW w:w="1800" w:type="dxa"/>
+          </w:tcPr>
+          <w:p>
+            <w:r>
+              <w:t>SQ learning (L2 penalty)</w:t>
+            </w:r>
+          </w:p>
+        </w:tc>
+        <w:tc>
+          <w:tcPr>
+            <w:tcW w:w="1800" w:type="dxa"/>
+          </w:tcPr>
+          <w:p>
+            <w:r>
+              <w:t>0.963 (0.112)</w:t>
+            </w:r>
+          </w:p>
+        </w:tc>
+        <w:tc>
+          <w:tcPr>
+            <w:tcW w:w="1800" w:type="dxa"/>
+          </w:tcPr>
+          <w:p>
+            <w:r>
+              <w:t>0.990 (0.037)</w:t>
+            </w:r>
+          </w:p>
+        </w:tc>
+        <w:tc>
+          <w:tcPr>
+            <w:tcW w:w="1800" w:type="dxa"/>
+          </w:tcPr>
+          <w:p>
+            <w:r>
+              <w:t>0.986 (0.028)</w:t>
+            </w:r>
+          </w:p>
+        </w:tc>
+        <w:tc>
+          <w:tcPr>
+            <w:tcW w:w="1800" w:type="dxa"/>
+          </w:tcPr>
+          <w:p>
+            <w:r>
+              <w:t>0.0392568002520345</w:t>
+            </w:r>
+          </w:p>
+        </w:tc>
+      </w:tr>
+    </w:tbl>
     <w:sectPr>
       <w:pgSz w:w="15840" w:h="12240" w:orient="landscape"/>
       <w:pgMar w:top="720" w:right="720" w:bottom="720" w:left="720" w:header="360" w:footer="360" w:gutter="0"/>

</xml_diff>

<commit_message>
Redo Setting IV target-to-truth outputs
</commit_message>
<xml_diff>
--- a/Simulation_random_walk/Writing/generated_tables/completed_main_tables.docx
+++ b/Simulation_random_walk/Writing/generated_tables/completed_main_tables.docx
@@ -23,1836 +23,11 @@
         <w:t>Table 1: Simulation Results for Setting I. For each setting, we run 200 replicates.</w:t>
       </w:r>
     </w:p>
-    <w:tbl>
-      <w:tblPr>
-        <w:tblStyle w:val="TableGrid"/>
-        <w:tblW w:w="0" w:type="auto"/>
-        <w:tblBorders>
-          <w:top w:val="single" w:sz="4" w:space="0" w:color="auto"/>
-          <w:left w:val="single" w:sz="4" w:space="0" w:color="auto"/>
-          <w:bottom w:val="single" w:sz="4" w:space="0" w:color="auto"/>
-          <w:right w:val="single" w:sz="4" w:space="0" w:color="auto"/>
-          <w:insideH w:val="single" w:sz="4" w:space="0" w:color="auto"/>
-          <w:insideV w:val="single" w:sz="4" w:space="0" w:color="auto"/>
-        </w:tblBorders>
-      </w:tblPr>
-      <w:tr>
-        <w:tc>
-          <w:tcPr>
-            <w:tcW w:w="1800" w:type="dxa"/>
-          </w:tcPr>
-          <w:p>
-            <w:r>
-              <w:rPr>
-                <w:b/>
-              </w:rPr>
-              <w:t>setting</w:t>
-            </w:r>
-          </w:p>
-        </w:tc>
-        <w:tc>
-          <w:tcPr>
-            <w:tcW w:w="1800" w:type="dxa"/>
-          </w:tcPr>
-          <w:p>
-            <w:r>
-              <w:rPr>
-                <w:b/>
-              </w:rPr>
-              <w:t>n</w:t>
-            </w:r>
-          </w:p>
-        </w:tc>
-        <w:tc>
-          <w:tcPr>
-            <w:tcW w:w="1800" w:type="dxa"/>
-          </w:tcPr>
-          <w:p>
-            <w:r>
-              <w:rPr>
-                <w:b/>
-              </w:rPr>
-              <w:t>method</w:t>
-            </w:r>
-          </w:p>
-        </w:tc>
-        <w:tc>
-          <w:tcPr>
-            <w:tcW w:w="1800" w:type="dxa"/>
-          </w:tcPr>
-          <w:p>
-            <w:r>
-              <w:rPr>
-                <w:b/>
-              </w:rPr>
-              <w:t>allocation_matching</w:t>
-            </w:r>
-          </w:p>
-        </w:tc>
-        <w:tc>
-          <w:tcPr>
-            <w:tcW w:w="1800" w:type="dxa"/>
-          </w:tcPr>
-          <w:p>
-            <w:r>
-              <w:rPr>
-                <w:b/>
-              </w:rPr>
-              <w:t>weighted_allocation_matching</w:t>
-            </w:r>
-          </w:p>
-        </w:tc>
-        <w:tc>
-          <w:tcPr>
-            <w:tcW w:w="1800" w:type="dxa"/>
-          </w:tcPr>
-          <w:p>
-            <w:r>
-              <w:rPr>
-                <w:b/>
-              </w:rPr>
-              <w:t>bias_a3</w:t>
-            </w:r>
-          </w:p>
-        </w:tc>
-      </w:tr>
-      <w:tr>
-        <w:tc>
-          <w:tcPr>
-            <w:tcW w:w="1800" w:type="dxa"/>
-          </w:tcPr>
-          <w:p>
-            <w:r>
-              <w:t>I</w:t>
-            </w:r>
-          </w:p>
-        </w:tc>
-        <w:tc>
-          <w:tcPr>
-            <w:tcW w:w="1800" w:type="dxa"/>
-          </w:tcPr>
-          <w:p>
-            <w:r>
-              <w:t>100</w:t>
-            </w:r>
-          </w:p>
-        </w:tc>
-        <w:tc>
-          <w:tcPr>
-            <w:tcW w:w="1800" w:type="dxa"/>
-          </w:tcPr>
-          <w:p>
-            <w:r>
-              <w:t>Q learning</w:t>
-            </w:r>
-          </w:p>
-        </w:tc>
-        <w:tc>
-          <w:tcPr>
-            <w:tcW w:w="1800" w:type="dxa"/>
-          </w:tcPr>
-          <w:p>
-            <w:r>
-              <w:t>0.907 (0.133)</w:t>
-            </w:r>
-          </w:p>
-        </w:tc>
-        <w:tc>
-          <w:tcPr>
-            <w:tcW w:w="1800" w:type="dxa"/>
-          </w:tcPr>
-          <w:p>
-            <w:r>
-              <w:t>0.958 (0.062)</w:t>
-            </w:r>
-          </w:p>
-        </w:tc>
-        <w:tc>
-          <w:tcPr>
-            <w:tcW w:w="1800" w:type="dxa"/>
-          </w:tcPr>
-          <w:p>
-            <w:r>
-              <w:t>-0.004 (0.142)</w:t>
-            </w:r>
-          </w:p>
-        </w:tc>
-      </w:tr>
-      <w:tr>
-        <w:tc>
-          <w:tcPr>
-            <w:tcW w:w="1800" w:type="dxa"/>
-          </w:tcPr>
-          <w:p>
-            <w:r>
-              <w:t>I</w:t>
-            </w:r>
-          </w:p>
-        </w:tc>
-        <w:tc>
-          <w:tcPr>
-            <w:tcW w:w="1800" w:type="dxa"/>
-          </w:tcPr>
-          <w:p>
-            <w:r>
-              <w:t>100</w:t>
-            </w:r>
-          </w:p>
-        </w:tc>
-        <w:tc>
-          <w:tcPr>
-            <w:tcW w:w="1800" w:type="dxa"/>
-          </w:tcPr>
-          <w:p>
-            <w:r>
-              <w:t>Q shared</w:t>
-            </w:r>
-          </w:p>
-        </w:tc>
-        <w:tc>
-          <w:tcPr>
-            <w:tcW w:w="1800" w:type="dxa"/>
-          </w:tcPr>
-          <w:p>
-            <w:r>
-              <w:t>0.924 (0.126)</w:t>
-            </w:r>
-          </w:p>
-        </w:tc>
-        <w:tc>
-          <w:tcPr>
-            <w:tcW w:w="1800" w:type="dxa"/>
-          </w:tcPr>
-          <w:p>
-            <w:r>
-              <w:t>0.966 (0.057)</w:t>
-            </w:r>
-          </w:p>
-        </w:tc>
-        <w:tc>
-          <w:tcPr>
-            <w:tcW w:w="1800" w:type="dxa"/>
-          </w:tcPr>
-          <w:p>
-            <w:r>
-              <w:t>0.019 (0.141)</w:t>
-            </w:r>
-          </w:p>
-        </w:tc>
-      </w:tr>
-      <w:tr>
-        <w:tc>
-          <w:tcPr>
-            <w:tcW w:w="1800" w:type="dxa"/>
-          </w:tcPr>
-          <w:p>
-            <w:r>
-              <w:t>I</w:t>
-            </w:r>
-          </w:p>
-        </w:tc>
-        <w:tc>
-          <w:tcPr>
-            <w:tcW w:w="1800" w:type="dxa"/>
-          </w:tcPr>
-          <w:p>
-            <w:r>
-              <w:t>100</w:t>
-            </w:r>
-          </w:p>
-        </w:tc>
-        <w:tc>
-          <w:tcPr>
-            <w:tcW w:w="1800" w:type="dxa"/>
-          </w:tcPr>
-          <w:p>
-            <w:r>
-              <w:t>Misspecified Q shared</w:t>
-            </w:r>
-          </w:p>
-        </w:tc>
-        <w:tc>
-          <w:tcPr>
-            <w:tcW w:w="1800" w:type="dxa"/>
-          </w:tcPr>
-          <w:p>
-            <w:r>
-              <w:t>0.558 (0.457)</w:t>
-            </w:r>
-          </w:p>
-        </w:tc>
-        <w:tc>
-          <w:tcPr>
-            <w:tcW w:w="1800" w:type="dxa"/>
-          </w:tcPr>
-          <w:p>
-            <w:r>
-              <w:t>0.794 (0.216)</w:t>
-            </w:r>
-          </w:p>
-        </w:tc>
-        <w:tc>
-          <w:tcPr>
-            <w:tcW w:w="1800" w:type="dxa"/>
-          </w:tcPr>
-          <w:p>
-            <w:r>
-              <w:t>0.019 (0.145)</w:t>
-            </w:r>
-          </w:p>
-        </w:tc>
-      </w:tr>
-      <w:tr>
-        <w:tc>
-          <w:tcPr>
-            <w:tcW w:w="1800" w:type="dxa"/>
-          </w:tcPr>
-          <w:p>
-            <w:r>
-              <w:t>I</w:t>
-            </w:r>
-          </w:p>
-        </w:tc>
-        <w:tc>
-          <w:tcPr>
-            <w:tcW w:w="1800" w:type="dxa"/>
-          </w:tcPr>
-          <w:p>
-            <w:r>
-              <w:t>100</w:t>
-            </w:r>
-          </w:p>
-        </w:tc>
-        <w:tc>
-          <w:tcPr>
-            <w:tcW w:w="1800" w:type="dxa"/>
-          </w:tcPr>
-          <w:p>
-            <w:r>
-              <w:t>SQ learning (L1 penalty)</w:t>
-            </w:r>
-          </w:p>
-        </w:tc>
-        <w:tc>
-          <w:tcPr>
-            <w:tcW w:w="1800" w:type="dxa"/>
-          </w:tcPr>
-          <w:p>
-            <w:r>
-              <w:t>0.917 (0.112)</w:t>
-            </w:r>
-          </w:p>
-        </w:tc>
-        <w:tc>
-          <w:tcPr>
-            <w:tcW w:w="1800" w:type="dxa"/>
-          </w:tcPr>
-          <w:p>
-            <w:r>
-              <w:t>0.963 (0.050)</w:t>
-            </w:r>
-          </w:p>
-        </w:tc>
-        <w:tc>
-          <w:tcPr>
-            <w:tcW w:w="1800" w:type="dxa"/>
-          </w:tcPr>
-          <w:p>
-            <w:r>
-              <w:t>-0.016 (0.136)</w:t>
-            </w:r>
-          </w:p>
-        </w:tc>
-      </w:tr>
-      <w:tr>
-        <w:tc>
-          <w:tcPr>
-            <w:tcW w:w="1800" w:type="dxa"/>
-          </w:tcPr>
-          <w:p>
-            <w:r>
-              <w:t>I</w:t>
-            </w:r>
-          </w:p>
-        </w:tc>
-        <w:tc>
-          <w:tcPr>
-            <w:tcW w:w="1800" w:type="dxa"/>
-          </w:tcPr>
-          <w:p>
-            <w:r>
-              <w:t>100</w:t>
-            </w:r>
-          </w:p>
-        </w:tc>
-        <w:tc>
-          <w:tcPr>
-            <w:tcW w:w="1800" w:type="dxa"/>
-          </w:tcPr>
-          <w:p>
-            <w:r>
-              <w:t>Misspecified SQ learning (L1 penalty)</w:t>
-            </w:r>
-          </w:p>
-        </w:tc>
-        <w:tc>
-          <w:tcPr>
-            <w:tcW w:w="1800" w:type="dxa"/>
-          </w:tcPr>
-          <w:p>
-            <w:r>
-              <w:t>0.896 (0.160)</w:t>
-            </w:r>
-          </w:p>
-        </w:tc>
-        <w:tc>
-          <w:tcPr>
-            <w:tcW w:w="1800" w:type="dxa"/>
-          </w:tcPr>
-          <w:p>
-            <w:r>
-              <w:t>0.953 (0.073)</w:t>
-            </w:r>
-          </w:p>
-        </w:tc>
-        <w:tc>
-          <w:tcPr>
-            <w:tcW w:w="1800" w:type="dxa"/>
-          </w:tcPr>
-          <w:p>
-            <w:r>
-              <w:t>-0.011 (0.137)</w:t>
-            </w:r>
-          </w:p>
-        </w:tc>
-      </w:tr>
-      <w:tr>
-        <w:tc>
-          <w:tcPr>
-            <w:tcW w:w="1800" w:type="dxa"/>
-          </w:tcPr>
-          <w:p>
-            <w:r>
-              <w:t>I</w:t>
-            </w:r>
-          </w:p>
-        </w:tc>
-        <w:tc>
-          <w:tcPr>
-            <w:tcW w:w="1800" w:type="dxa"/>
-          </w:tcPr>
-          <w:p>
-            <w:r>
-              <w:t>100</w:t>
-            </w:r>
-          </w:p>
-        </w:tc>
-        <w:tc>
-          <w:tcPr>
-            <w:tcW w:w="1800" w:type="dxa"/>
-          </w:tcPr>
-          <w:p>
-            <w:r>
-              <w:t>SQ learning (L2 penalty)</w:t>
-            </w:r>
-          </w:p>
-        </w:tc>
-        <w:tc>
-          <w:tcPr>
-            <w:tcW w:w="1800" w:type="dxa"/>
-          </w:tcPr>
-          <w:p>
-            <w:r>
-              <w:t>0.914 (0.113)</w:t>
-            </w:r>
-          </w:p>
-        </w:tc>
-        <w:tc>
-          <w:tcPr>
-            <w:tcW w:w="1800" w:type="dxa"/>
-          </w:tcPr>
-          <w:p>
-            <w:r>
-              <w:t>0.961 (0.051)</w:t>
-            </w:r>
-          </w:p>
-        </w:tc>
-        <w:tc>
-          <w:tcPr>
-            <w:tcW w:w="1800" w:type="dxa"/>
-          </w:tcPr>
-          <w:p>
-            <w:r>
-              <w:t>-0.015 (0.136)</w:t>
-            </w:r>
-          </w:p>
-        </w:tc>
-      </w:tr>
-      <w:tr>
-        <w:tc>
-          <w:tcPr>
-            <w:tcW w:w="1800" w:type="dxa"/>
-          </w:tcPr>
-          <w:p>
-            <w:r>
-              <w:t>I</w:t>
-            </w:r>
-          </w:p>
-        </w:tc>
-        <w:tc>
-          <w:tcPr>
-            <w:tcW w:w="1800" w:type="dxa"/>
-          </w:tcPr>
-          <w:p>
-            <w:r>
-              <w:t>100</w:t>
-            </w:r>
-          </w:p>
-        </w:tc>
-        <w:tc>
-          <w:tcPr>
-            <w:tcW w:w="1800" w:type="dxa"/>
-          </w:tcPr>
-          <w:p>
-            <w:r>
-              <w:t>Misspecified SQ learning (L2 penalty)</w:t>
-            </w:r>
-          </w:p>
-        </w:tc>
-        <w:tc>
-          <w:tcPr>
-            <w:tcW w:w="1800" w:type="dxa"/>
-          </w:tcPr>
-          <w:p>
-            <w:r>
-              <w:t>0.902 (0.147)</w:t>
-            </w:r>
-          </w:p>
-        </w:tc>
-        <w:tc>
-          <w:tcPr>
-            <w:tcW w:w="1800" w:type="dxa"/>
-          </w:tcPr>
-          <w:p>
-            <w:r>
-              <w:t>0.956 (0.068)</w:t>
-            </w:r>
-          </w:p>
-        </w:tc>
-        <w:tc>
-          <w:tcPr>
-            <w:tcW w:w="1800" w:type="dxa"/>
-          </w:tcPr>
-          <w:p>
-            <w:r>
-              <w:t>-0.012 (0.141)</w:t>
-            </w:r>
-          </w:p>
-        </w:tc>
-      </w:tr>
-      <w:tr>
-        <w:tc>
-          <w:tcPr>
-            <w:tcW w:w="1800" w:type="dxa"/>
-          </w:tcPr>
-          <w:p>
-            <w:r>
-              <w:t>I</w:t>
-            </w:r>
-          </w:p>
-        </w:tc>
-        <w:tc>
-          <w:tcPr>
-            <w:tcW w:w="1800" w:type="dxa"/>
-          </w:tcPr>
-          <w:p>
-            <w:r>
-              <w:t>300</w:t>
-            </w:r>
-          </w:p>
-        </w:tc>
-        <w:tc>
-          <w:tcPr>
-            <w:tcW w:w="1800" w:type="dxa"/>
-          </w:tcPr>
-          <w:p>
-            <w:r>
-              <w:t>Q learning</w:t>
-            </w:r>
-          </w:p>
-        </w:tc>
-        <w:tc>
-          <w:tcPr>
-            <w:tcW w:w="1800" w:type="dxa"/>
-          </w:tcPr>
-          <w:p>
-            <w:r>
-              <w:t>0.940 (0.073)</w:t>
-            </w:r>
-          </w:p>
-        </w:tc>
-        <w:tc>
-          <w:tcPr>
-            <w:tcW w:w="1800" w:type="dxa"/>
-          </w:tcPr>
-          <w:p>
-            <w:r>
-              <w:t>0.973 (0.033)</w:t>
-            </w:r>
-          </w:p>
-        </w:tc>
-        <w:tc>
-          <w:tcPr>
-            <w:tcW w:w="1800" w:type="dxa"/>
-          </w:tcPr>
-          <w:p>
-            <w:r>
-              <w:t>0.006 (0.076)</w:t>
-            </w:r>
-          </w:p>
-        </w:tc>
-      </w:tr>
-      <w:tr>
-        <w:tc>
-          <w:tcPr>
-            <w:tcW w:w="1800" w:type="dxa"/>
-          </w:tcPr>
-          <w:p>
-            <w:r>
-              <w:t>I</w:t>
-            </w:r>
-          </w:p>
-        </w:tc>
-        <w:tc>
-          <w:tcPr>
-            <w:tcW w:w="1800" w:type="dxa"/>
-          </w:tcPr>
-          <w:p>
-            <w:r>
-              <w:t>300</w:t>
-            </w:r>
-          </w:p>
-        </w:tc>
-        <w:tc>
-          <w:tcPr>
-            <w:tcW w:w="1800" w:type="dxa"/>
-          </w:tcPr>
-          <w:p>
-            <w:r>
-              <w:t>Q shared</w:t>
-            </w:r>
-          </w:p>
-        </w:tc>
-        <w:tc>
-          <w:tcPr>
-            <w:tcW w:w="1800" w:type="dxa"/>
-          </w:tcPr>
-          <w:p>
-            <w:r>
-              <w:t>0.962 (0.047)</w:t>
-            </w:r>
-          </w:p>
-        </w:tc>
-        <w:tc>
-          <w:tcPr>
-            <w:tcW w:w="1800" w:type="dxa"/>
-          </w:tcPr>
-          <w:p>
-            <w:r>
-              <w:t>0.983 (0.021)</w:t>
-            </w:r>
-          </w:p>
-        </w:tc>
-        <w:tc>
-          <w:tcPr>
-            <w:tcW w:w="1800" w:type="dxa"/>
-          </w:tcPr>
-          <w:p>
-            <w:r>
-              <w:t>0.019 (0.089)</w:t>
-            </w:r>
-          </w:p>
-        </w:tc>
-      </w:tr>
-      <w:tr>
-        <w:tc>
-          <w:tcPr>
-            <w:tcW w:w="1800" w:type="dxa"/>
-          </w:tcPr>
-          <w:p>
-            <w:r>
-              <w:t>I</w:t>
-            </w:r>
-          </w:p>
-        </w:tc>
-        <w:tc>
-          <w:tcPr>
-            <w:tcW w:w="1800" w:type="dxa"/>
-          </w:tcPr>
-          <w:p>
-            <w:r>
-              <w:t>300</w:t>
-            </w:r>
-          </w:p>
-        </w:tc>
-        <w:tc>
-          <w:tcPr>
-            <w:tcW w:w="1800" w:type="dxa"/>
-          </w:tcPr>
-          <w:p>
-            <w:r>
-              <w:t>Misspecified Q shared</w:t>
-            </w:r>
-          </w:p>
-        </w:tc>
-        <w:tc>
-          <w:tcPr>
-            <w:tcW w:w="1800" w:type="dxa"/>
-          </w:tcPr>
-          <w:p>
-            <w:r>
-              <w:t>0.779 (0.375)</w:t>
-            </w:r>
-          </w:p>
-        </w:tc>
-        <w:tc>
-          <w:tcPr>
-            <w:tcW w:w="1800" w:type="dxa"/>
-          </w:tcPr>
-          <w:p>
-            <w:r>
-              <w:t>0.900 (0.170)</w:t>
-            </w:r>
-          </w:p>
-        </w:tc>
-        <w:tc>
-          <w:tcPr>
-            <w:tcW w:w="1800" w:type="dxa"/>
-          </w:tcPr>
-          <w:p>
-            <w:r>
-              <w:t>0.018 (0.089)</w:t>
-            </w:r>
-          </w:p>
-        </w:tc>
-      </w:tr>
-      <w:tr>
-        <w:tc>
-          <w:tcPr>
-            <w:tcW w:w="1800" w:type="dxa"/>
-          </w:tcPr>
-          <w:p>
-            <w:r>
-              <w:t>I</w:t>
-            </w:r>
-          </w:p>
-        </w:tc>
-        <w:tc>
-          <w:tcPr>
-            <w:tcW w:w="1800" w:type="dxa"/>
-          </w:tcPr>
-          <w:p>
-            <w:r>
-              <w:t>300</w:t>
-            </w:r>
-          </w:p>
-        </w:tc>
-        <w:tc>
-          <w:tcPr>
-            <w:tcW w:w="1800" w:type="dxa"/>
-          </w:tcPr>
-          <w:p>
-            <w:r>
-              <w:t>SQ learning (L1 penalty)</w:t>
-            </w:r>
-          </w:p>
-        </w:tc>
-        <w:tc>
-          <w:tcPr>
-            <w:tcW w:w="1800" w:type="dxa"/>
-          </w:tcPr>
-          <w:p>
-            <w:r>
-              <w:t>0.947 (0.057)</w:t>
-            </w:r>
-          </w:p>
-        </w:tc>
-        <w:tc>
-          <w:tcPr>
-            <w:tcW w:w="1800" w:type="dxa"/>
-          </w:tcPr>
-          <w:p>
-            <w:r>
-              <w:t>0.976 (0.026)</w:t>
-            </w:r>
-          </w:p>
-        </w:tc>
-        <w:tc>
-          <w:tcPr>
-            <w:tcW w:w="1800" w:type="dxa"/>
-          </w:tcPr>
-          <w:p>
-            <w:r>
-              <w:t>-0.004 (0.078)</w:t>
-            </w:r>
-          </w:p>
-        </w:tc>
-      </w:tr>
-      <w:tr>
-        <w:tc>
-          <w:tcPr>
-            <w:tcW w:w="1800" w:type="dxa"/>
-          </w:tcPr>
-          <w:p>
-            <w:r>
-              <w:t>I</w:t>
-            </w:r>
-          </w:p>
-        </w:tc>
-        <w:tc>
-          <w:tcPr>
-            <w:tcW w:w="1800" w:type="dxa"/>
-          </w:tcPr>
-          <w:p>
-            <w:r>
-              <w:t>300</w:t>
-            </w:r>
-          </w:p>
-        </w:tc>
-        <w:tc>
-          <w:tcPr>
-            <w:tcW w:w="1800" w:type="dxa"/>
-          </w:tcPr>
-          <w:p>
-            <w:r>
-              <w:t>Misspecified SQ learning (L1 penalty)</w:t>
-            </w:r>
-          </w:p>
-        </w:tc>
-        <w:tc>
-          <w:tcPr>
-            <w:tcW w:w="1800" w:type="dxa"/>
-          </w:tcPr>
-          <w:p>
-            <w:r>
-              <w:t>0.939 (0.070)</w:t>
-            </w:r>
-          </w:p>
-        </w:tc>
-        <w:tc>
-          <w:tcPr>
-            <w:tcW w:w="1800" w:type="dxa"/>
-          </w:tcPr>
-          <w:p>
-            <w:r>
-              <w:t>0.973 (0.031)</w:t>
-            </w:r>
-          </w:p>
-        </w:tc>
-        <w:tc>
-          <w:tcPr>
-            <w:tcW w:w="1800" w:type="dxa"/>
-          </w:tcPr>
-          <w:p>
-            <w:r>
-              <w:t>0.002 (0.073)</w:t>
-            </w:r>
-          </w:p>
-        </w:tc>
-      </w:tr>
-      <w:tr>
-        <w:tc>
-          <w:tcPr>
-            <w:tcW w:w="1800" w:type="dxa"/>
-          </w:tcPr>
-          <w:p>
-            <w:r>
-              <w:t>I</w:t>
-            </w:r>
-          </w:p>
-        </w:tc>
-        <w:tc>
-          <w:tcPr>
-            <w:tcW w:w="1800" w:type="dxa"/>
-          </w:tcPr>
-          <w:p>
-            <w:r>
-              <w:t>300</w:t>
-            </w:r>
-          </w:p>
-        </w:tc>
-        <w:tc>
-          <w:tcPr>
-            <w:tcW w:w="1800" w:type="dxa"/>
-          </w:tcPr>
-          <w:p>
-            <w:r>
-              <w:t>SQ learning (L2 penalty)</w:t>
-            </w:r>
-          </w:p>
-        </w:tc>
-        <w:tc>
-          <w:tcPr>
-            <w:tcW w:w="1800" w:type="dxa"/>
-          </w:tcPr>
-          <w:p>
-            <w:r>
-              <w:t>0.944 (0.062)</w:t>
-            </w:r>
-          </w:p>
-        </w:tc>
-        <w:tc>
-          <w:tcPr>
-            <w:tcW w:w="1800" w:type="dxa"/>
-          </w:tcPr>
-          <w:p>
-            <w:r>
-              <w:t>0.975 (0.028)</w:t>
-            </w:r>
-          </w:p>
-        </w:tc>
-        <w:tc>
-          <w:tcPr>
-            <w:tcW w:w="1800" w:type="dxa"/>
-          </w:tcPr>
-          <w:p>
-            <w:r>
-              <w:t>-0.004 (0.076)</w:t>
-            </w:r>
-          </w:p>
-        </w:tc>
-      </w:tr>
-      <w:tr>
-        <w:tc>
-          <w:tcPr>
-            <w:tcW w:w="1800" w:type="dxa"/>
-          </w:tcPr>
-          <w:p>
-            <w:r>
-              <w:t>I</w:t>
-            </w:r>
-          </w:p>
-        </w:tc>
-        <w:tc>
-          <w:tcPr>
-            <w:tcW w:w="1800" w:type="dxa"/>
-          </w:tcPr>
-          <w:p>
-            <w:r>
-              <w:t>300</w:t>
-            </w:r>
-          </w:p>
-        </w:tc>
-        <w:tc>
-          <w:tcPr>
-            <w:tcW w:w="1800" w:type="dxa"/>
-          </w:tcPr>
-          <w:p>
-            <w:r>
-              <w:t>Misspecified SQ learning (L2 penalty)</w:t>
-            </w:r>
-          </w:p>
-        </w:tc>
-        <w:tc>
-          <w:tcPr>
-            <w:tcW w:w="1800" w:type="dxa"/>
-          </w:tcPr>
-          <w:p>
-            <w:r>
-              <w:t>0.939 (0.071)</w:t>
-            </w:r>
-          </w:p>
-        </w:tc>
-        <w:tc>
-          <w:tcPr>
-            <w:tcW w:w="1800" w:type="dxa"/>
-          </w:tcPr>
-          <w:p>
-            <w:r>
-              <w:t>0.973 (0.032)</w:t>
-            </w:r>
-          </w:p>
-        </w:tc>
-        <w:tc>
-          <w:tcPr>
-            <w:tcW w:w="1800" w:type="dxa"/>
-          </w:tcPr>
-          <w:p>
-            <w:r>
-              <w:t>0.003 (0.073)</w:t>
-            </w:r>
-          </w:p>
-        </w:tc>
-      </w:tr>
-      <w:tr>
-        <w:tc>
-          <w:tcPr>
-            <w:tcW w:w="1800" w:type="dxa"/>
-          </w:tcPr>
-          <w:p>
-            <w:r>
-              <w:t>I</w:t>
-            </w:r>
-          </w:p>
-        </w:tc>
-        <w:tc>
-          <w:tcPr>
-            <w:tcW w:w="1800" w:type="dxa"/>
-          </w:tcPr>
-          <w:p>
-            <w:r>
-              <w:t>500</w:t>
-            </w:r>
-          </w:p>
-        </w:tc>
-        <w:tc>
-          <w:tcPr>
-            <w:tcW w:w="1800" w:type="dxa"/>
-          </w:tcPr>
-          <w:p>
-            <w:r>
-              <w:t>Q learning</w:t>
-            </w:r>
-          </w:p>
-        </w:tc>
-        <w:tc>
-          <w:tcPr>
-            <w:tcW w:w="1800" w:type="dxa"/>
-          </w:tcPr>
-          <w:p>
-            <w:r>
-              <w:t>0.953 (0.064)</w:t>
-            </w:r>
-          </w:p>
-        </w:tc>
-        <w:tc>
-          <w:tcPr>
-            <w:tcW w:w="1800" w:type="dxa"/>
-          </w:tcPr>
-          <w:p>
-            <w:r>
-              <w:t>0.979 (0.028)</w:t>
-            </w:r>
-          </w:p>
-        </w:tc>
-        <w:tc>
-          <w:tcPr>
-            <w:tcW w:w="1800" w:type="dxa"/>
-          </w:tcPr>
-          <w:p>
-            <w:r>
-              <w:t>0.002 (0.067)</w:t>
-            </w:r>
-          </w:p>
-        </w:tc>
-      </w:tr>
-      <w:tr>
-        <w:tc>
-          <w:tcPr>
-            <w:tcW w:w="1800" w:type="dxa"/>
-          </w:tcPr>
-          <w:p>
-            <w:r>
-              <w:t>I</w:t>
-            </w:r>
-          </w:p>
-        </w:tc>
-        <w:tc>
-          <w:tcPr>
-            <w:tcW w:w="1800" w:type="dxa"/>
-          </w:tcPr>
-          <w:p>
-            <w:r>
-              <w:t>500</w:t>
-            </w:r>
-          </w:p>
-        </w:tc>
-        <w:tc>
-          <w:tcPr>
-            <w:tcW w:w="1800" w:type="dxa"/>
-          </w:tcPr>
-          <w:p>
-            <w:r>
-              <w:t>Q shared</w:t>
-            </w:r>
-          </w:p>
-        </w:tc>
-        <w:tc>
-          <w:tcPr>
-            <w:tcW w:w="1800" w:type="dxa"/>
-          </w:tcPr>
-          <w:p>
-            <w:r>
-              <w:t>0.967 (0.048)</w:t>
-            </w:r>
-          </w:p>
-        </w:tc>
-        <w:tc>
-          <w:tcPr>
-            <w:tcW w:w="1800" w:type="dxa"/>
-          </w:tcPr>
-          <w:p>
-            <w:r>
-              <w:t>0.985 (0.021)</w:t>
-            </w:r>
-          </w:p>
-        </w:tc>
-        <w:tc>
-          <w:tcPr>
-            <w:tcW w:w="1800" w:type="dxa"/>
-          </w:tcPr>
-          <w:p>
-            <w:r>
-              <w:t>0.008 (0.072)</w:t>
-            </w:r>
-          </w:p>
-        </w:tc>
-      </w:tr>
-      <w:tr>
-        <w:tc>
-          <w:tcPr>
-            <w:tcW w:w="1800" w:type="dxa"/>
-          </w:tcPr>
-          <w:p>
-            <w:r>
-              <w:t>I</w:t>
-            </w:r>
-          </w:p>
-        </w:tc>
-        <w:tc>
-          <w:tcPr>
-            <w:tcW w:w="1800" w:type="dxa"/>
-          </w:tcPr>
-          <w:p>
-            <w:r>
-              <w:t>500</w:t>
-            </w:r>
-          </w:p>
-        </w:tc>
-        <w:tc>
-          <w:tcPr>
-            <w:tcW w:w="1800" w:type="dxa"/>
-          </w:tcPr>
-          <w:p>
-            <w:r>
-              <w:t>Misspecified Q shared</w:t>
-            </w:r>
-          </w:p>
-        </w:tc>
-        <w:tc>
-          <w:tcPr>
-            <w:tcW w:w="1800" w:type="dxa"/>
-          </w:tcPr>
-          <w:p>
-            <w:r>
-              <w:t>0.810 (0.357)</w:t>
-            </w:r>
-          </w:p>
-        </w:tc>
-        <w:tc>
-          <w:tcPr>
-            <w:tcW w:w="1800" w:type="dxa"/>
-          </w:tcPr>
-          <w:p>
-            <w:r>
-              <w:t>0.914 (0.164)</w:t>
-            </w:r>
-          </w:p>
-        </w:tc>
-        <w:tc>
-          <w:tcPr>
-            <w:tcW w:w="1800" w:type="dxa"/>
-          </w:tcPr>
-          <w:p>
-            <w:r>
-              <w:t>0.007 (0.076)</w:t>
-            </w:r>
-          </w:p>
-        </w:tc>
-      </w:tr>
-      <w:tr>
-        <w:tc>
-          <w:tcPr>
-            <w:tcW w:w="1800" w:type="dxa"/>
-          </w:tcPr>
-          <w:p>
-            <w:r>
-              <w:t>I</w:t>
-            </w:r>
-          </w:p>
-        </w:tc>
-        <w:tc>
-          <w:tcPr>
-            <w:tcW w:w="1800" w:type="dxa"/>
-          </w:tcPr>
-          <w:p>
-            <w:r>
-              <w:t>500</w:t>
-            </w:r>
-          </w:p>
-        </w:tc>
-        <w:tc>
-          <w:tcPr>
-            <w:tcW w:w="1800" w:type="dxa"/>
-          </w:tcPr>
-          <w:p>
-            <w:r>
-              <w:t>SQ learning (L1 penalty)</w:t>
-            </w:r>
-          </w:p>
-        </w:tc>
-        <w:tc>
-          <w:tcPr>
-            <w:tcW w:w="1800" w:type="dxa"/>
-          </w:tcPr>
-          <w:p>
-            <w:r>
-              <w:t>0.949 (0.055)</w:t>
-            </w:r>
-          </w:p>
-        </w:tc>
-        <w:tc>
-          <w:tcPr>
-            <w:tcW w:w="1800" w:type="dxa"/>
-          </w:tcPr>
-          <w:p>
-            <w:r>
-              <w:t>0.977 (0.025)</w:t>
-            </w:r>
-          </w:p>
-        </w:tc>
-        <w:tc>
-          <w:tcPr>
-            <w:tcW w:w="1800" w:type="dxa"/>
-          </w:tcPr>
-          <w:p>
-            <w:r>
-              <w:t>-0.013 (0.065)</w:t>
-            </w:r>
-          </w:p>
-        </w:tc>
-      </w:tr>
-      <w:tr>
-        <w:tc>
-          <w:tcPr>
-            <w:tcW w:w="1800" w:type="dxa"/>
-          </w:tcPr>
-          <w:p>
-            <w:r>
-              <w:t>I</w:t>
-            </w:r>
-          </w:p>
-        </w:tc>
-        <w:tc>
-          <w:tcPr>
-            <w:tcW w:w="1800" w:type="dxa"/>
-          </w:tcPr>
-          <w:p>
-            <w:r>
-              <w:t>500</w:t>
-            </w:r>
-          </w:p>
-        </w:tc>
-        <w:tc>
-          <w:tcPr>
-            <w:tcW w:w="1800" w:type="dxa"/>
-          </w:tcPr>
-          <w:p>
-            <w:r>
-              <w:t>Misspecified SQ learning (L1 penalty)</w:t>
-            </w:r>
-          </w:p>
-        </w:tc>
-        <w:tc>
-          <w:tcPr>
-            <w:tcW w:w="1800" w:type="dxa"/>
-          </w:tcPr>
-          <w:p>
-            <w:r>
-              <w:t>0.952 (0.055)</w:t>
-            </w:r>
-          </w:p>
-        </w:tc>
-        <w:tc>
-          <w:tcPr>
-            <w:tcW w:w="1800" w:type="dxa"/>
-          </w:tcPr>
-          <w:p>
-            <w:r>
-              <w:t>0.978 (0.025)</w:t>
-            </w:r>
-          </w:p>
-        </w:tc>
-        <w:tc>
-          <w:tcPr>
-            <w:tcW w:w="1800" w:type="dxa"/>
-          </w:tcPr>
-          <w:p>
-            <w:r>
-              <w:t>-0.005 (0.065)</w:t>
-            </w:r>
-          </w:p>
-        </w:tc>
-      </w:tr>
-      <w:tr>
-        <w:tc>
-          <w:tcPr>
-            <w:tcW w:w="1800" w:type="dxa"/>
-          </w:tcPr>
-          <w:p>
-            <w:r>
-              <w:t>I</w:t>
-            </w:r>
-          </w:p>
-        </w:tc>
-        <w:tc>
-          <w:tcPr>
-            <w:tcW w:w="1800" w:type="dxa"/>
-          </w:tcPr>
-          <w:p>
-            <w:r>
-              <w:t>500</w:t>
-            </w:r>
-          </w:p>
-        </w:tc>
-        <w:tc>
-          <w:tcPr>
-            <w:tcW w:w="1800" w:type="dxa"/>
-          </w:tcPr>
-          <w:p>
-            <w:r>
-              <w:t>SQ learning (L2 penalty)</w:t>
-            </w:r>
-          </w:p>
-        </w:tc>
-        <w:tc>
-          <w:tcPr>
-            <w:tcW w:w="1800" w:type="dxa"/>
-          </w:tcPr>
-          <w:p>
-            <w:r>
-              <w:t>0.951 (0.052)</w:t>
-            </w:r>
-          </w:p>
-        </w:tc>
-        <w:tc>
-          <w:tcPr>
-            <w:tcW w:w="1800" w:type="dxa"/>
-          </w:tcPr>
-          <w:p>
-            <w:r>
-              <w:t>0.978 (0.024)</w:t>
-            </w:r>
-          </w:p>
-        </w:tc>
-        <w:tc>
-          <w:tcPr>
-            <w:tcW w:w="1800" w:type="dxa"/>
-          </w:tcPr>
-          <w:p>
-            <w:r>
-              <w:t>-0.013 (0.065)</w:t>
-            </w:r>
-          </w:p>
-        </w:tc>
-      </w:tr>
-      <w:tr>
-        <w:tc>
-          <w:tcPr>
-            <w:tcW w:w="1800" w:type="dxa"/>
-          </w:tcPr>
-          <w:p>
-            <w:r>
-              <w:t>I</w:t>
-            </w:r>
-          </w:p>
-        </w:tc>
-        <w:tc>
-          <w:tcPr>
-            <w:tcW w:w="1800" w:type="dxa"/>
-          </w:tcPr>
-          <w:p>
-            <w:r>
-              <w:t>500</w:t>
-            </w:r>
-          </w:p>
-        </w:tc>
-        <w:tc>
-          <w:tcPr>
-            <w:tcW w:w="1800" w:type="dxa"/>
-          </w:tcPr>
-          <w:p>
-            <w:r>
-              <w:t>Misspecified SQ learning (L2 penalty)</w:t>
-            </w:r>
-          </w:p>
-        </w:tc>
-        <w:tc>
-          <w:tcPr>
-            <w:tcW w:w="1800" w:type="dxa"/>
-          </w:tcPr>
-          <w:p>
-            <w:r>
-              <w:t>0.955 (0.059)</w:t>
-            </w:r>
-          </w:p>
-        </w:tc>
-        <w:tc>
-          <w:tcPr>
-            <w:tcW w:w="1800" w:type="dxa"/>
-          </w:tcPr>
-          <w:p>
-            <w:r>
-              <w:t>0.980 (0.026)</w:t>
-            </w:r>
-          </w:p>
-        </w:tc>
-        <w:tc>
-          <w:tcPr>
-            <w:tcW w:w="1800" w:type="dxa"/>
-          </w:tcPr>
-          <w:p>
-            <w:r>
-              <w:t>0.001 (0.066)</w:t>
-            </w:r>
-          </w:p>
-        </w:tc>
-      </w:tr>
-      <w:tr>
-        <w:tc>
-          <w:tcPr>
-            <w:tcW w:w="1800" w:type="dxa"/>
-          </w:tcPr>
-          <w:p>
-            <w:r>
-              <w:t>I</w:t>
-            </w:r>
-          </w:p>
-        </w:tc>
-        <w:tc>
-          <w:tcPr>
-            <w:tcW w:w="1800" w:type="dxa"/>
-          </w:tcPr>
-          <w:p>
-            <w:r>
-              <w:t>1000</w:t>
-            </w:r>
-          </w:p>
-        </w:tc>
-        <w:tc>
-          <w:tcPr>
-            <w:tcW w:w="1800" w:type="dxa"/>
-          </w:tcPr>
-          <w:p>
-            <w:r>
-              <w:t>Q learning</w:t>
-            </w:r>
-          </w:p>
-        </w:tc>
-        <w:tc>
-          <w:tcPr>
-            <w:tcW w:w="1800" w:type="dxa"/>
-          </w:tcPr>
-          <w:p>
-            <w:r>
-              <w:t>0.953 (0.047)</w:t>
-            </w:r>
-          </w:p>
-        </w:tc>
-        <w:tc>
-          <w:tcPr>
-            <w:tcW w:w="1800" w:type="dxa"/>
-          </w:tcPr>
-          <w:p>
-            <w:r>
-              <w:t>0.979 (0.021)</w:t>
-            </w:r>
-          </w:p>
-        </w:tc>
-        <w:tc>
-          <w:tcPr>
-            <w:tcW w:w="1800" w:type="dxa"/>
-          </w:tcPr>
-          <w:p>
-            <w:r>
-              <w:t>0.001 (0.046)</w:t>
-            </w:r>
-          </w:p>
-        </w:tc>
-      </w:tr>
-      <w:tr>
-        <w:tc>
-          <w:tcPr>
-            <w:tcW w:w="1800" w:type="dxa"/>
-          </w:tcPr>
-          <w:p>
-            <w:r>
-              <w:t>I</w:t>
-            </w:r>
-          </w:p>
-        </w:tc>
-        <w:tc>
-          <w:tcPr>
-            <w:tcW w:w="1800" w:type="dxa"/>
-          </w:tcPr>
-          <w:p>
-            <w:r>
-              <w:t>1000</w:t>
-            </w:r>
-          </w:p>
-        </w:tc>
-        <w:tc>
-          <w:tcPr>
-            <w:tcW w:w="1800" w:type="dxa"/>
-          </w:tcPr>
-          <w:p>
-            <w:r>
-              <w:t>Q shared</w:t>
-            </w:r>
-          </w:p>
-        </w:tc>
-        <w:tc>
-          <w:tcPr>
-            <w:tcW w:w="1800" w:type="dxa"/>
-          </w:tcPr>
-          <w:p>
-            <w:r>
-              <w:t>0.963 (0.045)</w:t>
-            </w:r>
-          </w:p>
-        </w:tc>
-        <w:tc>
-          <w:tcPr>
-            <w:tcW w:w="1800" w:type="dxa"/>
-          </w:tcPr>
-          <w:p>
-            <w:r>
-              <w:t>0.984 (0.020)</w:t>
-            </w:r>
-          </w:p>
-        </w:tc>
-        <w:tc>
-          <w:tcPr>
-            <w:tcW w:w="1800" w:type="dxa"/>
-          </w:tcPr>
-          <w:p>
-            <w:r>
-              <w:t>0.009 (0.050)</w:t>
-            </w:r>
-          </w:p>
-        </w:tc>
-      </w:tr>
-      <w:tr>
-        <w:tc>
-          <w:tcPr>
-            <w:tcW w:w="1800" w:type="dxa"/>
-          </w:tcPr>
-          <w:p>
-            <w:r>
-              <w:t>I</w:t>
-            </w:r>
-          </w:p>
-        </w:tc>
-        <w:tc>
-          <w:tcPr>
-            <w:tcW w:w="1800" w:type="dxa"/>
-          </w:tcPr>
-          <w:p>
-            <w:r>
-              <w:t>1000</w:t>
-            </w:r>
-          </w:p>
-        </w:tc>
-        <w:tc>
-          <w:tcPr>
-            <w:tcW w:w="1800" w:type="dxa"/>
-          </w:tcPr>
-          <w:p>
-            <w:r>
-              <w:t>Misspecified Q shared</w:t>
-            </w:r>
-          </w:p>
-        </w:tc>
-        <w:tc>
-          <w:tcPr>
-            <w:tcW w:w="1800" w:type="dxa"/>
-          </w:tcPr>
-          <w:p>
-            <w:r>
-              <w:t>0.897 (0.250)</w:t>
-            </w:r>
-          </w:p>
-        </w:tc>
-        <w:tc>
-          <w:tcPr>
-            <w:tcW w:w="1800" w:type="dxa"/>
-          </w:tcPr>
-          <w:p>
-            <w:r>
-              <w:t>0.952 (0.118)</w:t>
-            </w:r>
-          </w:p>
-        </w:tc>
-        <w:tc>
-          <w:tcPr>
-            <w:tcW w:w="1800" w:type="dxa"/>
-          </w:tcPr>
-          <w:p>
-            <w:r>
-              <w:t>0.008 (0.052)</w:t>
-            </w:r>
-          </w:p>
-        </w:tc>
-      </w:tr>
-      <w:tr>
-        <w:tc>
-          <w:tcPr>
-            <w:tcW w:w="1800" w:type="dxa"/>
-          </w:tcPr>
-          <w:p>
-            <w:r>
-              <w:t>I</w:t>
-            </w:r>
-          </w:p>
-        </w:tc>
-        <w:tc>
-          <w:tcPr>
-            <w:tcW w:w="1800" w:type="dxa"/>
-          </w:tcPr>
-          <w:p>
-            <w:r>
-              <w:t>1000</w:t>
-            </w:r>
-          </w:p>
-        </w:tc>
-        <w:tc>
-          <w:tcPr>
-            <w:tcW w:w="1800" w:type="dxa"/>
-          </w:tcPr>
-          <w:p>
-            <w:r>
-              <w:t>SQ learning (L1 penalty)</w:t>
-            </w:r>
-          </w:p>
-        </w:tc>
-        <w:tc>
-          <w:tcPr>
-            <w:tcW w:w="1800" w:type="dxa"/>
-          </w:tcPr>
-          <w:p>
-            <w:r>
-              <w:t>0.950 (0.048)</w:t>
-            </w:r>
-          </w:p>
-        </w:tc>
-        <w:tc>
-          <w:tcPr>
-            <w:tcW w:w="1800" w:type="dxa"/>
-          </w:tcPr>
-          <w:p>
-            <w:r>
-              <w:t>0.977 (0.022)</w:t>
-            </w:r>
-          </w:p>
-        </w:tc>
-        <w:tc>
-          <w:tcPr>
-            <w:tcW w:w="1800" w:type="dxa"/>
-          </w:tcPr>
-          <w:p>
-            <w:r>
-              <w:t>-0.005 (0.047)</w:t>
-            </w:r>
-          </w:p>
-        </w:tc>
-      </w:tr>
-      <w:tr>
-        <w:tc>
-          <w:tcPr>
-            <w:tcW w:w="1800" w:type="dxa"/>
-          </w:tcPr>
-          <w:p>
-            <w:r>
-              <w:t>I</w:t>
-            </w:r>
-          </w:p>
-        </w:tc>
-        <w:tc>
-          <w:tcPr>
-            <w:tcW w:w="1800" w:type="dxa"/>
-          </w:tcPr>
-          <w:p>
-            <w:r>
-              <w:t>1000</w:t>
-            </w:r>
-          </w:p>
-        </w:tc>
-        <w:tc>
-          <w:tcPr>
-            <w:tcW w:w="1800" w:type="dxa"/>
-          </w:tcPr>
-          <w:p>
-            <w:r>
-              <w:t>Misspecified SQ learning (L1 penalty)</w:t>
-            </w:r>
-          </w:p>
-        </w:tc>
-        <w:tc>
-          <w:tcPr>
-            <w:tcW w:w="1800" w:type="dxa"/>
-          </w:tcPr>
-          <w:p>
-            <w:r>
-              <w:t>0.949 (0.048)</w:t>
-            </w:r>
-          </w:p>
-        </w:tc>
-        <w:tc>
-          <w:tcPr>
-            <w:tcW w:w="1800" w:type="dxa"/>
-          </w:tcPr>
-          <w:p>
-            <w:r>
-              <w:t>0.977 (0.022)</w:t>
-            </w:r>
-          </w:p>
-        </w:tc>
-        <w:tc>
-          <w:tcPr>
-            <w:tcW w:w="1800" w:type="dxa"/>
-          </w:tcPr>
-          <w:p>
-            <w:r>
-              <w:t>-0.002 (0.046)</w:t>
-            </w:r>
-          </w:p>
-        </w:tc>
-      </w:tr>
-      <w:tr>
-        <w:tc>
-          <w:tcPr>
-            <w:tcW w:w="1800" w:type="dxa"/>
-          </w:tcPr>
-          <w:p>
-            <w:r>
-              <w:t>I</w:t>
-            </w:r>
-          </w:p>
-        </w:tc>
-        <w:tc>
-          <w:tcPr>
-            <w:tcW w:w="1800" w:type="dxa"/>
-          </w:tcPr>
-          <w:p>
-            <w:r>
-              <w:t>1000</w:t>
-            </w:r>
-          </w:p>
-        </w:tc>
-        <w:tc>
-          <w:tcPr>
-            <w:tcW w:w="1800" w:type="dxa"/>
-          </w:tcPr>
-          <w:p>
-            <w:r>
-              <w:t>SQ learning (L2 penalty)</w:t>
-            </w:r>
-          </w:p>
-        </w:tc>
-        <w:tc>
-          <w:tcPr>
-            <w:tcW w:w="1800" w:type="dxa"/>
-          </w:tcPr>
-          <w:p>
-            <w:r>
-              <w:t>0.948 (0.048)</w:t>
-            </w:r>
-          </w:p>
-        </w:tc>
-        <w:tc>
-          <w:tcPr>
-            <w:tcW w:w="1800" w:type="dxa"/>
-          </w:tcPr>
-          <w:p>
-            <w:r>
-              <w:t>0.977 (0.022)</w:t>
-            </w:r>
-          </w:p>
-        </w:tc>
-        <w:tc>
-          <w:tcPr>
-            <w:tcW w:w="1800" w:type="dxa"/>
-          </w:tcPr>
-          <w:p>
-            <w:r>
-              <w:t>-0.005 (0.047)</w:t>
-            </w:r>
-          </w:p>
-        </w:tc>
-      </w:tr>
-      <w:tr>
-        <w:tc>
-          <w:tcPr>
-            <w:tcW w:w="1800" w:type="dxa"/>
-          </w:tcPr>
-          <w:p>
-            <w:r>
-              <w:t>I</w:t>
-            </w:r>
-          </w:p>
-        </w:tc>
-        <w:tc>
-          <w:tcPr>
-            <w:tcW w:w="1800" w:type="dxa"/>
-          </w:tcPr>
-          <w:p>
-            <w:r>
-              <w:t>1000</w:t>
-            </w:r>
-          </w:p>
-        </w:tc>
-        <w:tc>
-          <w:tcPr>
-            <w:tcW w:w="1800" w:type="dxa"/>
-          </w:tcPr>
-          <w:p>
-            <w:r>
-              <w:t>Misspecified SQ learning (L2 penalty)</w:t>
-            </w:r>
-          </w:p>
-        </w:tc>
-        <w:tc>
-          <w:tcPr>
-            <w:tcW w:w="1800" w:type="dxa"/>
-          </w:tcPr>
-          <w:p>
-            <w:r>
-              <w:t>0.954 (0.047)</w:t>
-            </w:r>
-          </w:p>
-        </w:tc>
-        <w:tc>
-          <w:tcPr>
-            <w:tcW w:w="1800" w:type="dxa"/>
-          </w:tcPr>
-          <w:p>
-            <w:r>
-              <w:t>0.979 (0.021)</w:t>
-            </w:r>
-          </w:p>
-        </w:tc>
-        <w:tc>
-          <w:tcPr>
-            <w:tcW w:w="1800" w:type="dxa"/>
-          </w:tcPr>
-          <w:p>
-            <w:r>
-              <w:t>0.001 (0.046)</w:t>
-            </w:r>
-          </w:p>
-        </w:tc>
-      </w:tr>
-    </w:tbl>
+    <w:p>
+      <w:r>
+        <w:t>Setting I revised calibration and production are pending, so Table 1 is pending.</w:t>
+      </w:r>
+    </w:p>
     <w:p>
       <w:r>
         <w:rPr>

</xml_diff>